<commit_message>
docs: refine Persian project status brief
</commit_message>
<xml_diff>
--- a/docs/presentations/NextOps_Project_Status_Bilingual.docx
+++ b/docs/presentations/NextOps_Project_Status_Bilingual.docx
@@ -1849,7 +1849,7 @@
           <w:lang w:val="fa-IR" w:bidi="fa-IR"/>
           <w:rtl w:val="1"/>
         </w:rPr>
-        <w:t>گزارش وضعیت اجرایی پروژه NextOps</w:t>
+        <w:t>گزارش پیشرفت و وضعیت اجرایی پروژهٔ NextOps</w:t>
       </w:r>
     </w:p>
     <w:p>
@@ -1867,7 +1867,7 @@
           <w:lang w:val="fa-IR" w:bidi="fa-IR"/>
           <w:rtl w:val="1"/>
         </w:rPr>
-        <w:t>کارهای انجام‌شده و برنامهٔ ادامهٔ تحویل</w:t>
+        <w:t>جمع‌بندی کارهای انجام‌شده و برنامهٔ ادامهٔ کار</w:t>
       </w:r>
     </w:p>
     <w:p>
@@ -1906,7 +1906,7 @@
           <w:lang w:val="fa-IR" w:bidi="fa-IR"/>
           <w:rtl w:val="1"/>
         </w:rPr>
-        <w:t>هر چهار سرور Ubuntu و بسته‌های هر نقش آماده شده‌اند و مدل محلی روی CPU یک smoke test محدود و احرازهویت‌شده را با موفقیت گذرانده است. گام بعدی، استقرار کنترل‌شدهٔ سرویس‌ها، اتصال فقط‌خواندنی Zabbix، اثبات بازیابی و پذیرش کامل آفلاین است.</w:t>
+        <w:t>هر چهار سرور Ubuntu از نظر سیستم‌عامل، منابع، امنیت پایه و بسته‌های نرم‌افزاری آماده شده‌اند. مدل محلی نیز روی پردازندهٔ مرکزی، در یک آزمون مقدماتی محدود و احرازهویت‌شده، با موفقیت اجرا شده است. گام بعدی، استقرار کنترل‌شدهٔ سرویس‌ها، اتصال فقط‌خواندنی Zabbix، اثبات بازیابی و پذیرش کامل در شرایط قطع اینترنت است.</w:t>
       </w:r>
     </w:p>
     <w:p>
@@ -1969,7 +1969,7 @@
           <w:lang w:val="fa-IR" w:bidi="fa-IR"/>
           <w:rtl w:val="1"/>
         </w:rPr>
-        <w:t>NextOps از مرحلهٔ صرفاً معماری عبور کرده است. مخزن اکنون پایهٔ آزمودهٔ برنامه و سرویس inference را دارد؛ چهار سرور نقش‌محور بررسی شده‌اند؛ بسته‌های لازم نصب شده‌اند؛ و مدل محلی روی سرور AI پاسخ تازهٔ فارسی و انگلیسی تولید کرده است. با این حال، سامانه هنوز استقرار تولیدی نیست: پایگاه‌های تولید و Zabbix مقداردهی نشده‌اند، برنامه و connector مستقر نیستند و پذیرش سرتاسری با اینترنت قطع انجام نشده است.</w:t>
+        <w:t>پروژه از مرحلهٔ طراحی صرف عبور کرده و وارد مرحلهٔ آماده‌سازی برای استقرار کنترل‌شده شده است. کد منبع اکنون پایه‌های آزموده‌شدهٔ برنامه و سرویس پردازش مدل را در بر دارد؛ هر چهار سرور متناسب با نقش خود ارزیابی شده‌اند؛ بسته‌های لازم نصب شده‌اند؛ و مدل تثبیت‌شده روی سرور هوش مصنوعی پاسخ‌های تازهٔ فارسی و انگلیسی تولید کرده است. با وجود این پیشرفت، سامانه هنوز آمادهٔ بهره‌برداری نیست: پایگاه دادهٔ اصلی برنامه و Zabbix مقداردهی اولیه نشده‌اند، برنامه و اتصال‌دهنده مستقر نشده‌اند و آزمون سرتاسری در شرایط قطع اینترنت انجام نشده است.</w:t>
       </w:r>
     </w:p>
     <w:p>
@@ -2044,7 +2044,7 @@
                 <w:lang w:val="fa-IR" w:bidi="fa-IR"/>
                 <w:rtl w:val="1"/>
               </w:rPr>
-              <w:t>پذیرش باقی‌مانده</w:t>
+              <w:t>شرط باقیمانده برای پذیرش</w:t>
             </w:r>
           </w:p>
         </w:tc>
@@ -2074,7 +2074,7 @@
                 <w:lang w:val="fa-IR" w:bidi="fa-IR"/>
                 <w:rtl w:val="1"/>
               </w:rPr>
-              <w:t>نتیجهٔ تأییدشده</w:t>
+              <w:t>شواهد موجود</w:t>
             </w:r>
           </w:p>
         </w:tc>
@@ -2104,7 +2104,7 @@
                 <w:lang w:val="fa-IR" w:bidi="fa-IR"/>
                 <w:rtl w:val="1"/>
               </w:rPr>
-              <w:t>وضعیت</w:t>
+              <w:t>وضعیت کنونی</w:t>
             </w:r>
           </w:p>
         </w:tc>
@@ -2134,7 +2134,7 @@
                 <w:lang w:val="fa-IR" w:bidi="fa-IR"/>
                 <w:rtl w:val="1"/>
               </w:rPr>
-              <w:t>محور کار</w:t>
+              <w:t>حوزه</w:t>
             </w:r>
           </w:p>
         </w:tc>
@@ -2167,7 +2167,7 @@
                 <w:lang w:val="fa-IR" w:bidi="fa-IR"/>
                 <w:rtl w:val="1"/>
               </w:rPr>
-              <w:t>ادامهٔ مجوز جداگانه برای هر عملیات</w:t>
+              <w:t>ادامهٔ مجوز مستقل برای هر عملیات</w:t>
             </w:r>
           </w:p>
         </w:tc>
@@ -2198,7 +2198,7 @@
                 <w:lang w:val="fa-IR" w:bidi="fa-IR"/>
                 <w:rtl w:val="1"/>
               </w:rPr>
-              <w:t>مرحلهٔ صفر و ADRهای 0001 تا 0006 پذیرفته شده‌اند</w:t>
+              <w:t>مرحلهٔ صفر و تصمیم‌های معماری 0001 تا 0006 تصویب شده‌اند</w:t>
             </w:r>
           </w:p>
         </w:tc>
@@ -2229,7 +2229,7 @@
                 <w:lang w:val="fa-IR" w:bidi="fa-IR"/>
                 <w:rtl w:val="1"/>
               </w:rPr>
-              <w:t>مبنای پذیرفته‌شده</w:t>
+              <w:t>مبنای کار پذیرفته شده است</w:t>
             </w:r>
           </w:p>
         </w:tc>
@@ -2293,7 +2293,7 @@
                 <w:lang w:val="fa-IR" w:bidi="fa-IR"/>
                 <w:rtl w:val="1"/>
               </w:rPr>
-              <w:t>بسته‌بندی و استقرار، TLS، UI، backup و restore</w:t>
+              <w:t>بسته‌بندی و استقرار، TLS، رابط مرورگر، پشتیبان‌گیری و بازیابی</w:t>
             </w:r>
           </w:p>
         </w:tc>
@@ -2324,7 +2324,7 @@
                 <w:lang w:val="fa-IR" w:bidi="fa-IR"/>
                 <w:rtl w:val="1"/>
               </w:rPr>
-              <w:t>هویت، policy، PostgreSQL، کار ماندگار، audit و API</w:t>
+              <w:t>هویت، مجوزدهی، PostgreSQL، اجرای ماندگار کارها، سابقهٔ ممیزی و API</w:t>
             </w:r>
           </w:p>
         </w:tc>
@@ -2355,7 +2355,7 @@
                 <w:lang w:val="fa-IR" w:bidi="fa-IR"/>
                 <w:rtl w:val="1"/>
               </w:rPr>
-              <w:t>پیاده‌سازی در source</w:t>
+              <w:t>در کد منبع پیاده‌سازی شده است</w:t>
             </w:r>
           </w:p>
         </w:tc>
@@ -2419,7 +2419,7 @@
                 <w:lang w:val="fa-IR" w:bidi="fa-IR"/>
                 <w:rtl w:val="1"/>
               </w:rPr>
-              <w:t>نصب پیکربندی و پذیرش سرویس</w:t>
+              <w:t>نصب پیکربندی و آزمون پذیرش سرویس‌ها</w:t>
             </w:r>
           </w:p>
         </w:tc>
@@ -2450,7 +2450,7 @@
                 <w:lang w:val="fa-IR" w:bidi="fa-IR"/>
                 <w:rtl w:val="1"/>
               </w:rPr>
-              <w:t>Ubuntu 24.04.5، systemd سالم، UFW و فقط SSH عمومی</w:t>
+              <w:t>Ubuntu 24.04.5، سلامت systemd، فعال بودن UFW و دسترسی عمومی محدود به SSH</w:t>
             </w:r>
           </w:p>
         </w:tc>
@@ -2481,7 +2481,7 @@
                 <w:lang w:val="fa-IR" w:bidi="fa-IR"/>
                 <w:rtl w:val="1"/>
               </w:rPr>
-              <w:t>صلاحیت‌سنجی و آماده</w:t>
+              <w:t>ارزیابی و آماده شده‌اند</w:t>
             </w:r>
           </w:p>
         </w:tc>
@@ -2545,7 +2545,7 @@
                 <w:lang w:val="fa-IR" w:bidi="fa-IR"/>
                 <w:rtl w:val="1"/>
               </w:rPr>
-              <w:t>unit تولید و آزمون کیفیت، بار، خطا و آفلاین</w:t>
+              <w:t>استقرار واحد سرویس و آزمون کیفیت، بار، خطا و قطع اینترنت</w:t>
             </w:r>
           </w:p>
         </w:tc>
@@ -2576,7 +2576,7 @@
                 <w:lang w:val="fa-IR" w:bidi="fa-IR"/>
                 <w:rtl w:val="1"/>
               </w:rPr>
-              <w:t>runtime و مدل ثابت؛ تولید دوزبانه روی loopback</w:t>
+              <w:t>محیط اجرا و مدل تثبیت‌شده؛ تولید دوزبانه روی رابط محلی</w:t>
             </w:r>
           </w:p>
         </w:tc>
@@ -2607,7 +2607,7 @@
                 <w:lang w:val="fa-IR" w:bidi="fa-IR"/>
                 <w:rtl w:val="1"/>
               </w:rPr>
-              <w:t>smoke test موفق</w:t>
+              <w:t>آزمون مقدماتی موفق بوده است</w:t>
             </w:r>
           </w:p>
         </w:tc>
@@ -2638,7 +2638,7 @@
                 <w:lang w:val="fa-IR" w:bidi="fa-IR"/>
                 <w:rtl w:val="1"/>
               </w:rPr>
-              <w:t>inference روی CPU</w:t>
+              <w:t>پردازش مدل روی CPU</w:t>
             </w:r>
           </w:p>
         </w:tc>
@@ -2671,7 +2671,7 @@
                 <w:lang w:val="fa-IR" w:bidi="fa-IR"/>
                 <w:rtl w:val="1"/>
               </w:rPr>
-              <w:t>مقداردهی Zabbix و استقرار reader محدود</w:t>
+              <w:t>مقداردهی Zabbix و استقرار حساب و اتصال فقط‌خواندنی</w:t>
             </w:r>
           </w:p>
         </w:tc>
@@ -2702,7 +2702,7 @@
                 <w:lang w:val="fa-IR" w:bidi="fa-IR"/>
                 <w:rtl w:val="1"/>
               </w:rPr>
-              <w:t>stack نصب اما غیرفعال و محیط connector آماده</w:t>
+              <w:t>اجزا نصب اما غیرفعال‌اند و محیط اتصال‌دهنده آماده است</w:t>
             </w:r>
           </w:p>
         </w:tc>
@@ -2733,7 +2733,7 @@
                 <w:lang w:val="fa-IR" w:bidi="fa-IR"/>
                 <w:rtl w:val="1"/>
               </w:rPr>
-              <w:t>فقط لایهٔ package</w:t>
+              <w:t>فقط محیط نرم‌افزاری آماده است</w:t>
             </w:r>
           </w:p>
         </w:tc>
@@ -2764,7 +2764,7 @@
                 <w:lang w:val="fa-IR" w:bidi="fa-IR"/>
                 <w:rtl w:val="1"/>
               </w:rPr>
-              <w:t>Zabbix و connector</w:t>
+              <w:t>Zabbix و اتصال‌دهنده</w:t>
             </w:r>
           </w:p>
         </w:tc>
@@ -2797,7 +2797,7 @@
                 <w:lang w:val="fa-IR" w:bidi="fa-IR"/>
                 <w:rtl w:val="1"/>
               </w:rPr>
-              <w:t>اثبات پاسخ تازه و مستند با WAN قطع</w:t>
+              <w:t>اثبات پاسخ تازه و مستند در شرایط قطع WAN</w:t>
             </w:r>
           </w:p>
         </w:tc>
@@ -2828,7 +2828,7 @@
                 <w:lang w:val="fa-IR" w:bidi="fa-IR"/>
                 <w:rtl w:val="1"/>
               </w:rPr>
-              <w:t>قرارداد و موارد پذیرش تعریف شده‌اند</w:t>
+              <w:t>قراردادها و شرایط پذیرش مستند شده‌اند</w:t>
             </w:r>
           </w:p>
         </w:tc>
@@ -2859,7 +2859,7 @@
                 <w:lang w:val="fa-IR" w:bidi="fa-IR"/>
                 <w:rtl w:val="1"/>
               </w:rPr>
-              <w:t>هنوز اثبات نشده</w:t>
+              <w:t>هنوز اثبات نشده است</w:t>
             </w:r>
           </w:p>
         </w:tc>
@@ -2890,7 +2890,7 @@
                 <w:lang w:val="fa-IR" w:bidi="fa-IR"/>
                 <w:rtl w:val="1"/>
               </w:rPr>
-              <w:t>خروجی آفلاین</w:t>
+              <w:t>خروجی بدون اینترنت</w:t>
             </w:r>
           </w:p>
         </w:tc>
@@ -2919,7 +2919,7 @@
           <w:lang w:val="fa-IR" w:bidi="fa-IR"/>
           <w:rtl w:val="1"/>
         </w:rPr>
-        <w:t>کارهای انجام‌شده</w:t>
+        <w:t>آنچه تاکنون انجام شده است</w:t>
       </w:r>
     </w:p>
     <w:p>
@@ -2940,7 +2940,7 @@
           <w:lang w:val="fa-IR" w:bidi="fa-IR"/>
           <w:rtl w:val="1"/>
         </w:rPr>
-        <w:t>معماری نیازمندی‌ها و ایمنی</w:t>
+        <w:t>معماری الزامات و مرزهای ایمنی</w:t>
       </w:r>
     </w:p>
     <w:p>
@@ -2962,7 +2962,7 @@
           <w:lang w:val="fa-IR" w:bidi="fa-IR"/>
           <w:rtl w:val="1"/>
         </w:rPr>
-        <w:t>مالک، مرحلهٔ صفر، مسیر تحویل 1A تا 1E و ADRهای 0001 تا 0006 را پذیرفته است.</w:t>
+        <w:t>مالک پروژه مرحلهٔ صفر، مسیر تحویل 1A تا 1E و تصمیم‌های معماری 0001 تا 0006 را پذیرفته است.</w:t>
       </w:r>
     </w:p>
     <w:p>
@@ -2984,7 +2984,7 @@
           <w:lang w:val="fa-IR" w:bidi="fa-IR"/>
           <w:rtl w:val="1"/>
         </w:rPr>
-        <w:t>چهار ماشین اولیه در مجموع ۴۰ vCPU، حافظهٔ ۱۸۴ GiB و دیسک مجازی ۹۸۰ GiB دارند.</w:t>
+        <w:t>چهار ماشین مجازی اولیه در مجموع ۴۰ پردازندهٔ مجازی، ۱۸۴ گیبی‌بایت حافظه و ۹۸۰ گیبی‌بایت دیسک مجازی دارند.</w:t>
       </w:r>
     </w:p>
     <w:p>
@@ -3006,7 +3006,7 @@
           <w:lang w:val="fa-IR" w:bidi="fa-IR"/>
           <w:rtl w:val="1"/>
         </w:rPr>
-        <w:t>تولید پاسخ فقط روی CPU محلی است و هیچ وابستگی به GPU یا fallback ابری وجود ندارد.</w:t>
+        <w:t>تولید پاسخ به‌طور کامل روی پردازندهٔ مرکزی محلی انجام می‌شود؛ سامانه به GPU وابسته نیست و مسیر جایگزین ابری ندارد.</w:t>
       </w:r>
     </w:p>
     <w:p>
@@ -3028,7 +3028,7 @@
           <w:lang w:val="fa-IR" w:bidi="fa-IR"/>
           <w:rtl w:val="1"/>
         </w:rPr>
-        <w:t>مرحلهٔ یک فقط‌خواندنی است و مدل نه credential مقصد دارد و نه اختیار تأیید تغییر.</w:t>
+        <w:t>مرحلهٔ نخست فقط‌خواندنی است و مدل نه به اطلاعات ورود مقصد دسترسی دارد و نه اختیار تأیید تغییر را در اختیار می‌گیرد.</w:t>
       </w:r>
     </w:p>
     <w:p>
@@ -3049,7 +3049,7 @@
           <w:lang w:val="fa-IR" w:bidi="fa-IR"/>
           <w:rtl w:val="1"/>
         </w:rPr>
-        <w:t>پایهٔ مخزن و برنامه</w:t>
+        <w:t>پایهٔ نرم‌افزار و ساختار مخزن</w:t>
       </w:r>
     </w:p>
     <w:p>
@@ -3071,7 +3071,7 @@
           <w:lang w:val="fa-IR" w:bidi="fa-IR"/>
           <w:rtl w:val="1"/>
         </w:rPr>
-        <w:t>مرحلهٔ 1A شامل هویت Argon2id، session غیرشفاف و hash‌شده، PostgreSQL و Alembic، run ماندگار و idempotent، lease منقضی‌شونده، audit محدود به append و FastAPI احرازهویت‌شده است.</w:t>
+        <w:t>مرحلهٔ 1A هویت مبتنی بر Argon2id، نشست‌های امن، PostgreSQL و Alembic، اجرای ماندگار و تکرارپذیر کارها، مهلت منقضی‌شوندهٔ مالکیت کار، سابقهٔ ممیزی صرفاً‌افزودنی و API احرازهویت‌شده با FastAPI را فراهم کرده است.</w:t>
       </w:r>
     </w:p>
     <w:p>
@@ -3093,7 +3093,7 @@
           <w:lang w:val="fa-IR" w:bidi="fa-IR"/>
           <w:rtl w:val="1"/>
         </w:rPr>
-        <w:t>مرحلهٔ 1B قرارداد LLMProvider، مرزهای احرازهویت‌شدهٔ inference، adapter فقط-loopback، صف یک درخواست فعال و دو درخواست منتظر، حدود ورودی و خروجی، cancellation، readiness امن و خطاهای صریح را دارد.</w:t>
+        <w:t>مرحلهٔ 1B قرارداد LLMProvider، مرزهای احرازهویت‌شدهٔ پردازش مدل، رابط محلی llama.cpp، صف یک درخواست فعال و دو درخواست در انتظار، محدودیت ورودی و خروجی، لغو درخواست، بررسی ایمن آمادگی و خطاهای روشن را پیاده کرده است.</w:t>
       </w:r>
     </w:p>
     <w:p>
@@ -3115,7 +3115,7 @@
           <w:lang w:val="fa-IR" w:bidi="fa-IR"/>
           <w:rtl w:val="1"/>
         </w:rPr>
-        <w:t>چهار پروندهٔ معتبرشده با schema و installerهای محافظت‌شده، تحویل هر نقش را بدون انتشار شناسه یا credential خصوصی تعریف می‌کنند.</w:t>
+        <w:t>چهار پروندهٔ استقرار همراه با طرح‌واره و نصب‌کننده‌های محافظت‌شده، شیوهٔ تحویل هر نقش را بدون انتشار شناسه یا اطلاعات ورود خصوصی مشخص می‌کنند.</w:t>
       </w:r>
     </w:p>
     <w:p>
@@ -3136,7 +3136,7 @@
           <w:lang w:val="fa-IR" w:bidi="fa-IR"/>
           <w:rtl w:val="1"/>
         </w:rPr>
-        <w:t>صلاحیت‌سنجی سرورها و آماده‌سازی بسته‌ها</w:t>
+        <w:t>آماده‌سازی و ارزیابی اولیهٔ سرورها</w:t>
       </w:r>
     </w:p>
     <w:p>
@@ -3158,7 +3158,7 @@
           <w:lang w:val="fa-IR" w:bidi="fa-IR"/>
           <w:rtl w:val="1"/>
         </w:rPr>
-        <w:t>هر چهار مهمان Ubuntu 24.04.5 LTS کنترل کلید میزبان، احراز هویت فقط با کلید، رد root مستقیم، منابع، mount، زمان، VMware Tools، firewall، listener، update، reboot و سلامت سیستم را گذرانده‌اند.</w:t>
+        <w:t>هر چهار مهمان Ubuntu 24.04.5 LTS از نظر کلید میزبان، احراز هویت صرفاً با کلید، ممنوع بودن ورود مستقیم root، منابع، دیسک‌ها، زمان، VMware Tools، دیوارهٔ آتش، درگاه‌های شنونده، به‌روزرسانی، نیاز به راه‌اندازی مجدد و سلامت سیستم بررسی شده‌اند.</w:t>
       </w:r>
     </w:p>
     <w:p>
@@ -3180,7 +3180,7 @@
           <w:lang w:val="fa-IR" w:bidi="fa-IR"/>
           <w:rtl w:val="1"/>
         </w:rPr>
-        <w:t>بسته‌های هر نقش از proxy سخت‌گیرانهٔ موجود و بدون ارتقای کلی سیستم‌عامل نصب شدند. شروع خودکار سرویس و ایجاد خودکار cluster در PostgreSQL مسدود شد.</w:t>
+        <w:t>بسته‌های هر نقش از مسیر زنجیرهٔ پراکسی موجود و بدون ارتقای کلی سیستم‌عامل نصب شدند. راه‌اندازی خودکار سرویس‌ها و ایجاد خودکار خوشهٔ PostgreSQL نیز مسدود شد.</w:t>
       </w:r>
     </w:p>
     <w:p>
@@ -3202,7 +3202,7 @@
           <w:lang w:val="fa-IR" w:bidi="fa-IR"/>
           <w:rtl w:val="1"/>
         </w:rPr>
-        <w:t>میزبان برنامه PostgreSQL 16.15 و Nginx 1.24 دارد. AI دارای GCC 13.3، CMake 3.28، Ninja 1.11، OpenBLAS 0.3.26 و uv 0.12.17 است. connector از محیط مجازی Python 3.12 پشتیبانی می‌کند. میزبان پایش Zabbix 7.0.30، PostgreSQL 16.15، Nginx 1.24، PHP 8.3.6، frontend، scriptهای SQL و Agent 2 را دارد.</w:t>
+        <w:t>سرور برنامه PostgreSQL 16.15 و Nginx 1.24 دارد. سرور هوش مصنوعی به GCC 13.3، CMake 3.28، Ninja 1.11، OpenBLAS 0.3.26 و uv 0.12.17 مجهز است. سرور اتصال‌دهنده از محیط مجازی Python 3.12 پشتیبانی می‌کند. سرور پایش نیز Zabbix 7.0.30، PostgreSQL 16.15، Nginx 1.24، PHP 8.3.6، رابط وب، اسکریپت‌های SQL و Agent 2 را در اختیار دارد.</w:t>
       </w:r>
     </w:p>
     <w:p>
@@ -3224,7 +3224,7 @@
           <w:lang w:val="fa-IR" w:bidi="fa-IR"/>
           <w:rtl w:val="1"/>
         </w:rPr>
-        <w:t>هویت‌های بدون login و مسیرهای محافظت‌شده ساخته شده‌اند و سرویس‌های محصول، پایگاه و وب طبق برنامه inactive و disabled مانده‌اند.</w:t>
+        <w:t>شناسه‌های سیستمیِ بدون امکان ورود و مسیرهای محافظت‌شده ساخته شده‌اند و سرویس‌های برنامه، پایگاه داده و وب طبق برنامه همچنان متوقف و غیرفعال‌اند.</w:t>
       </w:r>
     </w:p>
     <w:p>
@@ -3246,7 +3246,7 @@
           <w:lang w:val="fa-IR" w:bidi="fa-IR"/>
           <w:rtl w:val="1"/>
         </w:rPr>
-        <w:t>Docker نصب نشد، زیرا طراحی native systemd به آن نیاز ندارد و container socket مرز اعتماد را گسترش می‌دهد.</w:t>
+        <w:t>Docker نصب نشد، زیرا معماری فعلی بر بسته‌های بومی و systemd متکی است و سوکت Docker بدون نیاز فنی، دامنهٔ دسترسی ممتاز را گسترش می‌دهد.</w:t>
       </w:r>
     </w:p>
     <w:p>
@@ -3267,7 +3267,7 @@
           <w:lang w:val="fa-IR" w:bidi="fa-IR"/>
           <w:rtl w:val="1"/>
         </w:rPr>
-        <w:t>شاهد مدل محلی روی CPU</w:t>
+        <w:t>شواهد اجرای مدل محلی روی پردازندهٔ مرکزی</w:t>
       </w:r>
     </w:p>
     <w:p>
@@ -3289,7 +3289,7 @@
           <w:lang w:val="fa-IR" w:bidi="fa-IR"/>
           <w:rtl w:val="1"/>
         </w:rPr>
-        <w:t>revision ثابت llama.cpp در حالت Release با تنظیم native CPU، OpenMP و OpenBLAS و بدون پیوند GPU ساخته شد و checksum آن در manifest ثبت است.</w:t>
+        <w:t>نسخهٔ تثبیت‌شدهٔ llama.cpp در حالت Release، با بهینه‌سازی بومی CPU، OpenMP و OpenBLAS و بدون پیوند به GPU ساخته شد. چکیدهٔ فایل اجرایی نهایی در فهرست اقلام پردازش مدل ثبت شده است.</w:t>
       </w:r>
     </w:p>
     <w:p>
@@ -3311,7 +3311,7 @@
           <w:lang w:val="fa-IR" w:bidi="fa-IR"/>
           <w:rtl w:val="1"/>
         </w:rPr>
-        <w:t>فایل Qwen3-8B-Q4_K_M برابر ۵٬۰۲۷٬۷۸۳٬۴۸۸ بایت است و SHA-256 آن پیش و پس از انتقال به حجم محافظت‌شده برابر بود.</w:t>
+        <w:t>فایل Qwen3-8B-Q4_K_M برابر ۵٬۰۲۷٬۷۸۳٬۴۸۸ بایت است و مقدار SHA-256 آن پیش و پس از انتقال به فضای محافظت‌شده یکسان بود.</w:t>
       </w:r>
     </w:p>
     <w:p>
@@ -3333,7 +3333,7 @@
           <w:lang w:val="fa-IR" w:bidi="fa-IR"/>
           <w:rtl w:val="1"/>
         </w:rPr>
-        <w:t>سرویس موقت و احرازهویت‌شده فقط روی loopback، با یک slot، context برابر 8K، لایهٔ GPU صفر و Web UI غیرفعال اجرا شد. شروع سرد ۷ ثانیه بود؛ READY در ۶۳۰ میلی‌ثانیه و آماده در ۱۴۳۱ میلی‌ثانیه برگردانده شد و process یا listener باقی نماند.</w:t>
+        <w:t>یک سرویس موقت و احرازهویت‌شده فقط روی رابط محلی اجرا شد؛ ظرفیت آن یک درخواست هم‌زمان، پنجرهٔ متن آن 8K، تعداد لایه‌های GPU آن صفر و رابط وب آن غیرفعال بود. راه‌اندازی سرد ۷ ثانیه طول کشید؛ READY در ۶۳۰ میلی‌ثانیه و آماده در ۱۴۳۱ میلی‌ثانیه دریافت شد. پس از توقف نیز هیچ فرایند یا درگاه شنونده‌ای باقی نماند.</w:t>
       </w:r>
     </w:p>
     <w:p>
@@ -3355,7 +3355,7 @@
           <w:lang w:val="fa-IR" w:bidi="fa-IR"/>
           <w:rtl w:val="1"/>
         </w:rPr>
-        <w:t>این نتیجه فقط smoke test محدود است و پذیرش تولید، کیفیت، بار پایدار، بازیابی یا کارکرد با اینترنت قطع‌شده محسوب نمی‌شود.</w:t>
+        <w:t>این نتیجه تنها شواهد یک آزمون مقدماتی محدود است و به معنای پذیرش عملیاتی، تأیید کیفیت، آزمون بار پایدار، اثبات بازیابی یا پذیرش کارکرد در شرایط قطع اینترنت نیست.</w:t>
       </w:r>
     </w:p>
     <w:p>
@@ -3376,7 +3376,7 @@
           <w:lang w:val="fa-IR" w:bidi="fa-IR"/>
           <w:rtl w:val="1"/>
         </w:rPr>
-        <w:t>اعتبارسنجی انجام‌شده</w:t>
+        <w:t>نتایج آزمون و اعتبارسنجی</w:t>
       </w:r>
     </w:p>
     <w:p>
@@ -3398,7 +3398,7 @@
           <w:lang w:val="fa-IR" w:bidi="fa-IR"/>
           <w:rtl w:val="1"/>
         </w:rPr>
-        <w:t>format، lint، type سخت‌گیرانه، مستندات، پرونده‌های استقرار، artifactهای inference و installerها برای revision بازبینی‌شده قبول شدند.</w:t>
+        <w:t>قالب‌بندی کد، تحلیل ایستا، بررسی سخت‌گیرانهٔ نوع‌ها، مستندات، پرونده‌های استقرار، فایل‌های پردازش مدل و نصب‌کننده‌ها برای نسخهٔ بازبینی‌شده با موفقیت اعتبارسنجی شدند.</w:t>
       </w:r>
     </w:p>
     <w:p>
@@ -3420,7 +3420,7 @@
           <w:lang w:val="fa-IR" w:bidi="fa-IR"/>
           <w:rtl w:val="1"/>
         </w:rPr>
-        <w:t>روی desktop، هر ۷۱ آزمون non-integration قبول و پنج آزمون پایگاه به‌دلیل نبود URL محلی PostgreSQL به‌درستی skip شدند.</w:t>
+        <w:t>در محیط رومیزی، هر ۷۱ آزمون غیر یکپارچه موفق بود. پنج آزمون پایگاه داده به‌دلیل در دسترس نبودن نشانی PostgreSQL محلی اجرا نشد.</w:t>
       </w:r>
     </w:p>
     <w:p>
@@ -3442,7 +3442,7 @@
           <w:lang w:val="fa-IR" w:bidi="fa-IR"/>
           <w:rtl w:val="1"/>
         </w:rPr>
-        <w:t>روی سرور برنامه، همان revision از format، lint و type عبور کرد؛ هر ۷۱ آزمون non-integration و هر پنج آزمون integration روی cluster جداشدهٔ PostgreSQL 16.15 قبول شدند و cluster سپس حذف شد.</w:t>
+        <w:t>روی سرور برنامه، همان نسخه بررسی‌های قالب‌بندی، تحلیل ایستا و نوع‌ها را گذراند. هر ۷۱ آزمون غیر یکپارچه و هر پنج آزمون یکپارچه‌سازی روی یک خوشهٔ موقت و جداشدهٔ PostgreSQL 16.15 موفق بود؛ خوشه پس از پایان آزمون حذف شد.</w:t>
       </w:r>
     </w:p>
     <w:p>
@@ -3463,7 +3463,7 @@
           <w:lang w:val="fa-IR" w:bidi="fa-IR"/>
           <w:rtl w:val="1"/>
         </w:rPr>
-        <w:t>کارهای باقی‌مانده</w:t>
+        <w:t>کارهای باقی‌مانده تا تحویل</w:t>
       </w:r>
     </w:p>
     <w:p>
@@ -3484,7 +3484,7 @@
           <w:lang w:val="fa-IR" w:bidi="fa-IR"/>
           <w:rtl w:val="1"/>
         </w:rPr>
-        <w:t>سرویس تولید inference در مرحلهٔ 1B</w:t>
+        <w:t>آماده‌سازی سرویس پردازش مدل در مرحلهٔ 1B</w:t>
       </w:r>
     </w:p>
     <w:p>
@@ -3504,7 +3504,7 @@
           <w:lang w:val="fa-IR" w:bidi="fa-IR"/>
           <w:rtl w:val="1"/>
         </w:rPr>
-        <w:t>unit بازبینی‌شدهٔ nextops-ai و پیکربندی متعلق به root نصب شود؛ اتصال فقط روی loopback بماند؛ secretها امن ارجاع داده شوند؛ حدود CPU و حافظه اعمال شود؛ و احراز هویت، health، restart، log، overload، cancellation، timeout، rollback، کیفیت دوزبانه، بار و شروع سرد با اینترنت قطع آزموده شوند.</w:t>
+        <w:t>واحد بازبینی‌شدهٔ nextops-ai و پیکربندی متعلق به root نصب شود؛ سرویس فقط روی رابط محلی در دسترس باشد؛ اطلاعات محرمانه به‌شکل ایمن ارجاع داده شوند؛ محدودیت‌های CPU و حافظه اعمال شود؛ و احراز هویت، سلامت سرویس، راه‌اندازی مجدد، ثبت گزارش، ازدحام، لغو، پایان مهلت، بازگشت نسخه، کیفیت دوزبانه، بار و راه‌اندازی سرد در شرایط قطع اینترنت آزموده شوند.</w:t>
       </w:r>
     </w:p>
     <w:p>
@@ -3525,7 +3525,7 @@
           <w:lang w:val="fa-IR" w:bidi="fa-IR"/>
           <w:rtl w:val="1"/>
         </w:rPr>
-        <w:t>استقرار برنامه در مرحلهٔ 1A</w:t>
+        <w:t>استقرار برنامه و پایگاه داده در مرحلهٔ 1A</w:t>
       </w:r>
     </w:p>
     <w:p>
@@ -3545,7 +3545,7 @@
           <w:lang w:val="fa-IR" w:bidi="fa-IR"/>
           <w:rtl w:val="1"/>
         </w:rPr>
-        <w:t>release آفلاین بسته‌بندی، PostgreSQL 16 روی mount اختصاصی مقداردهی، roleهای کم‌دسترسی ساخته، migration اجرا، هویت bootstrap و سرویس‌های API و worker مستقر شوند. Nginx و TLS، UI مرورگر، تحویل secret، backup، restore و rollback نیز تکمیل شوند.</w:t>
+        <w:t>نسخهٔ آفلاین برنامه بسته‌بندی شود؛ PostgreSQL 16 روی محل اختصاصی دیسک مقداردهی اولیه شود؛ نقش‌های کم‌دسترسی ساخته شوند؛ مهاجرت‌های پایگاه داده اجرا شوند؛ هویت محلی اولیه ایجاد شود؛ و سرویس‌های API و پردازشگر پس‌زمینه مستقر شوند. Nginx و TLS، رابط مرورگر، تحویل امن اطلاعات محرمانه، پشتیبان‌گیری، بازیابی و بازگشت نسخه نیز تکمیل شوند.</w:t>
       </w:r>
     </w:p>
     <w:p>
@@ -3566,7 +3566,7 @@
           <w:lang w:val="fa-IR" w:bidi="fa-IR"/>
           <w:rtl w:val="1"/>
         </w:rPr>
-        <w:t>پیش‌نیاز Zabbix</w:t>
+        <w:t>راه‌اندازی Zabbix به‌عنوان پیش‌نیاز اتصال</w:t>
       </w:r>
     </w:p>
     <w:p>
@@ -3586,7 +3586,7 @@
           <w:lang w:val="fa-IR" w:bidi="fa-IR"/>
           <w:rtl w:val="1"/>
         </w:rPr>
-        <w:t>پایگاه Zabbix مقداردهی و schema وارد شود؛ Zabbix Server، Nginx، PHP-FPM و Agent 2 پیکربندی شوند؛ بازیابی مدیر محلی، self-monitoring، سنجش retention با رشد واقعی و هویت API فقط‌خواندنی و محدود برقرار شوند.</w:t>
+        <w:t>پایگاه Zabbix مقداردهی اولیه و طرح‌وارهٔ آن وارد شود؛ Zabbix Server، Nginx، PHP-FPM و Agent 2 پیکربندی شوند؛ مسیر بازیابی مدیر محلی، پایش خود سامانه، سنجش نگه‌داری داده بر پایهٔ رشد واقعی و حساب API فقط‌خواندنی با کمترین سطح دسترسی برقرار شوند.</w:t>
       </w:r>
     </w:p>
     <w:p>
@@ -3607,7 +3607,7 @@
           <w:lang w:val="fa-IR" w:bidi="fa-IR"/>
           <w:rtl w:val="1"/>
         </w:rPr>
-        <w:t>connector فقط‌خواندنی و نخستین پاسخ کاربردی</w:t>
+        <w:t>استقرار اتصال‌دهندهٔ فقط‌خواندنی و تولید نخستین پاسخ مستند</w:t>
       </w:r>
     </w:p>
     <w:p>
@@ -3627,7 +3627,7 @@
           <w:lang w:val="fa-IR" w:bidi="fa-IR"/>
           <w:rtl w:val="1"/>
         </w:rPr>
-        <w:t>gateway و runner جداشدهٔ Zabbix مستقر شوند. توکن محدود فقط در اختیار runner باشد، تنها روش‌های read فهرست‌شده مجاز باشند و اندازه و زمان پاسخ محدود شود. سپس سؤال تازهٔ فارسی و انگلیسی با شاهد جاری Zabbix، توضیح محلی CPU، زمان منبع، دامنه و audit نمایش داده شود.</w:t>
+        <w:t>درگاه و اجراکنندهٔ جداشدهٔ Zabbix مستقر شوند. توکن محدود فقط در اختیار همان اجراکننده باشد؛ تنها روش‌های خواندنِ ازپیش‌فهرست‌شده مجاز باشند؛ و اندازه و زمان پاسخ محدود شود. سپس یک پرسش تازهٔ فارسی و انگلیسی با شواهد جاری Zabbix، توضیح مدل محلی، زمان منبع، دامنه و سابقهٔ ممیزی نمایش داده شود.</w:t>
       </w:r>
     </w:p>
     <w:p>
@@ -3648,7 +3648,7 @@
           <w:lang w:val="fa-IR" w:bidi="fa-IR"/>
           <w:rtl w:val="1"/>
         </w:rPr>
-        <w:t>پذیرش آفلاین و بازیابی</w:t>
+        <w:t>آزمون کارکرد بدون اینترنت و بازیابی</w:t>
       </w:r>
     </w:p>
     <w:p>
@@ -3668,7 +3668,7 @@
           <w:lang w:val="fa-IR" w:bidi="fa-IR"/>
           <w:rtl w:val="1"/>
         </w:rPr>
-        <w:t>با WAN قطع، شروع سرد همهٔ سرویس‌ها، ورود تازهٔ محلی، رفتار در برابر توکن باطل و مقصد خارج از دسترس، برچسب دادهٔ قدیمی، کمبود فضا، سقف منابع، backup مستقل، restore و rollback روی هر چهار سرور و client تازه اثبات شوند.</w:t>
+        <w:t>در شرایط قطع WAN، راه‌اندازی سرد همهٔ سرویس‌ها، ورود تازهٔ محلی، رفتار در برابر توکن باطل و مقصد خارج از دسترس، برچسب دادهٔ قدیمی، کمبود فضای دیسک، محدودیت منابع، پشتیبان‌گیری مستقل، بازیابی و بازگشت نسخه روی هر چهار سرور و یک دستگاه کاربر تازه اثبات شوند.</w:t>
       </w:r>
     </w:p>
     <w:p>
@@ -3689,7 +3689,7 @@
           <w:lang w:val="fa-IR" w:bidi="fa-IR"/>
           <w:rtl w:val="1"/>
         </w:rPr>
-        <w:t>ترتیب پیشنهادی ادامهٔ کار</w:t>
+        <w:t>ترتیب پیشنهادی برای ادامه</w:t>
       </w:r>
     </w:p>
     <w:p>
@@ -3710,7 +3710,7 @@
           <w:lang w:val="fa-IR" w:bidi="fa-IR"/>
           <w:rtl w:val="1"/>
         </w:rPr>
-        <w:t>۱. سرویس AI تولیدی و ارزیابی دوزبانه و آفلاین مرحلهٔ 1B تکمیل شود.</w:t>
+        <w:t>۱. سرویس عملیاتی هوش مصنوعی آماده و ارزیابی دوزبانه و بدون اینترنت مرحلهٔ 1B تکمیل شود.</w:t>
       </w:r>
     </w:p>
     <w:p>
@@ -3731,7 +3731,7 @@
           <w:lang w:val="fa-IR" w:bidi="fa-IR"/>
           <w:rtl w:val="1"/>
         </w:rPr>
-        <w:t>۲. پایگاه، API، worker، reverse proxy، TLS، secret، backup و restore برنامه بسته‌بندی و مستقر شوند.</w:t>
+        <w:t>۲. پایگاه داده، API، پردازشگر پس‌زمینه، پراکسی معکوس، TLS، اطلاعات محرمانه، پشتیبان‌گیری و بازیابی برنامه بسته‌بندی و مستقر شوند.</w:t>
       </w:r>
     </w:p>
     <w:p>
@@ -3752,7 +3752,7 @@
           <w:lang w:val="fa-IR" w:bidi="fa-IR"/>
           <w:rtl w:val="1"/>
         </w:rPr>
-        <w:t>۳. Zabbix مقداردهی و هویت API فقط‌خواندنی و محدود ایجاد شود.</w:t>
+        <w:t>۳. Zabbix مقداردهی اولیه و حساب API فقط‌خواندنی با دسترسی محدود ایجاد شود.</w:t>
       </w:r>
     </w:p>
     <w:p>
@@ -3773,7 +3773,7 @@
           <w:lang w:val="fa-IR" w:bidi="fa-IR"/>
           <w:rtl w:val="1"/>
         </w:rPr>
-        <w:t>۴. connector مستقر و خواندن زنده و محدود مرحلهٔ 1C کامل شود.</w:t>
+        <w:t>۴. اتصال‌دهنده مستقر و خواندن زنده و محدود مرحلهٔ 1C تکمیل شود.</w:t>
       </w:r>
     </w:p>
     <w:p>
@@ -3794,7 +3794,7 @@
           <w:lang w:val="fa-IR" w:bidi="fa-IR"/>
           <w:rtl w:val="1"/>
         </w:rPr>
-        <w:t>۵. پاسخ مستند مرحلهٔ 1D نمایش داده شود و پذیرش آفلاین و بازیابی مرحلهٔ 1E پایان یابد.</w:t>
+        <w:t>۵. پاسخ مستند مرحلهٔ 1D ارائه و پذیرش کارکرد بدون اینترنت و بازیابی مرحلهٔ 1E نهایی شود.</w:t>
       </w:r>
     </w:p>
     <w:p>
@@ -3815,7 +3815,7 @@
           <w:lang w:val="fa-IR" w:bidi="fa-IR"/>
           <w:rtl w:val="1"/>
         </w:rPr>
-        <w:t>نتیجهٔ قابل ارائه</w:t>
+        <w:t>جمع‌بندی نهایی</w:t>
       </w:r>
     </w:p>
     <w:p>
@@ -3835,7 +3835,7 @@
           <w:lang w:val="fa-IR" w:bidi="fa-IR"/>
           <w:rtl w:val="1"/>
         </w:rPr>
-        <w:t>زیرساخت و پایهٔ نرم‌افزار برای آغاز استقرار کنترل‌شدهٔ سرویس‌ها آماده است. NextOps اکنون سرورهای تأییدشده، بسته‌های نصب‌شدهٔ هر نقش، پایهٔ مخزن آزموده و artifact عملیاتی مدل محلی روی CPU دارد. کار باقی‌مانده شامل پیکربندی تولید، مقداردهی سرویس‌های stateful، اتصال فقط‌خواندنی، اثبات بازیابی و پذیرش کامل آفلاین است. تا عبور از این دروازه‌ها، وضعیت دقیق پروژه آماده‌شده و تا حدی اعتبارسنجی‌شده است، نه آمادهٔ بهره‌برداری تولیدی.</w:t>
+        <w:t>زیرساخت و پایهٔ نرم‌افزاری برای آغاز استقرار کنترل‌شده آماده است. NextOps اکنون چهار سرور تأییدشده، بسته‌های نرم‌افزاری موردنیاز هر نقش، کد منبع آزموده‌شده و فایل عملیاتی مدل محلی برای پردازش روی CPU دارد. آنچه باقی مانده، پیکربندی عملیاتی، مقداردهی سرویس‌های دارای وضعیت ماندگار، اتصال فقط‌خواندنی، اثبات بازیابی و پذیرش کامل در شرایط قطع اینترنت است. تا عبور از این مراحل، پروژه را باید آماده برای آغاز استقرار و تا حدی اعتبارسنجی‌شده دانست، نه آمادهٔ بهره‌برداری.</w:t>
       </w:r>
     </w:p>
     <w:sectPr>
@@ -3883,7 +3883,7 @@
         <w:color w:val="646464"/>
         <w:sz w:val="16"/>
       </w:rPr>
-      <w:t>گزارش وضعیت اجرایی NextOps  |  ۳۰ شهریور ۱۴۰۵</w:t>
+      <w:t>گزارش پیشرفت و وضعیت اجرایی NextOps  |  ۳۰ شهریور ۱۴۰۵</w:t>
     </w:r>
   </w:p>
 </w:ftr>

</xml_diff>